<commit_message>
Update CV to premium design with new professional content and fixed image frame
</commit_message>
<xml_diff>
--- a/الرابط الرسمي بالموقع.docx
+++ b/الرابط الرسمي بالموقع.docx
@@ -111,21 +111,15 @@
     <w:p>
       <w:pPr>
         <w:rPr>
-          <w:rFonts w:hint="cs"/>
-          <w:sz w:val="48"/>
-          <w:szCs w:val="48"/>
-          <w:rtl/>
-        </w:rPr>
-      </w:pPr>
-      <w:r>
-        <w:rPr>
-          <w:rStyle w:val="a3"/>
-          <w:rFonts w:ascii="Segoe UI" w:hAnsi="Segoe UI" w:cs="Segoe UI"/>
-          <w:color w:val="CCCCCC"/>
           <w:sz w:val="36"/>
           <w:szCs w:val="36"/>
-          <w:bdr w:val="single" w:sz="2" w:space="0" w:color="E5E7EB" w:frame="1"/>
-          <w:shd w:val="clear" w:color="auto" w:fill="252526"/>
+          <w:rtl/>
+        </w:rPr>
+      </w:pPr>
+      <w:r>
+        <w:rPr>
+          <w:sz w:val="36"/>
+          <w:szCs w:val="36"/>
           <w:rtl/>
         </w:rPr>
         <w:br/>
@@ -137,25 +131,13 @@
             <w:sz w:val="36"/>
             <w:szCs w:val="36"/>
           </w:rPr>
-          <w:t>https://AbedAraheem.github.io/</w:t>
+          <w:t>https://AbedAraheem.github.io</w:t>
         </w:r>
       </w:hyperlink>
       <w:r>
         <w:rPr>
-          <w:rStyle w:val="a3"/>
-          <w:rFonts w:ascii="Segoe UI" w:hAnsi="Segoe UI" w:cs="Segoe UI"/>
-          <w:color w:val="CCCCCC"/>
-          <w:sz w:val="48"/>
-          <w:szCs w:val="48"/>
-          <w:bdr w:val="single" w:sz="2" w:space="0" w:color="E5E7EB" w:frame="1"/>
-          <w:shd w:val="clear" w:color="auto" w:fill="252526"/>
-        </w:rPr>
-        <w:br/>
-      </w:r>
-      <w:r>
-        <w:rPr>
-          <w:sz w:val="48"/>
-          <w:szCs w:val="48"/>
+          <w:sz w:val="36"/>
+          <w:szCs w:val="36"/>
           <w:rtl/>
         </w:rPr>
         <w:br/>
@@ -625,6 +607,18 @@
       <w:u w:val="single"/>
     </w:rPr>
   </w:style>
+  <w:style w:type="character" w:styleId="a4">
+    <w:name w:val="Unresolved Mention"/>
+    <w:basedOn w:val="a0"/>
+    <w:uiPriority w:val="99"/>
+    <w:semiHidden/>
+    <w:unhideWhenUsed/>
+    <w:rsid w:val="005076D0"/>
+    <w:rPr>
+      <w:color w:val="605E5C"/>
+      <w:shd w:val="clear" w:color="auto" w:fill="E1DFDD"/>
+    </w:rPr>
+  </w:style>
 </w:styles>
 </file>
 

</xml_diff>